<commit_message>
Make email optional and move it to a decision for later
Co-Authored-By: Claude Fable 5.1 <noreply@anthropic.com>
</commit_message>
<xml_diff>
--- a/GUIDE.docx
+++ b/GUIDE.docx
@@ -202,7 +202,7 @@
         <w:contextualSpacing/>
       </w:pPr>
       <w:r>
-        <w:t xml:space="preserve">At 5:00 a.m. a scheduled task writes a morning brief. It reads the task workbook and the week’s calendar, scans the subject lines of flagged email, and proposes the day’s priorities. Its most useful move is the cross-check between sources. It catches a deadline that lands on a day already full of meetings, or a meeting that needs preparation nobody put on the list.</w:t>
+        <w:t xml:space="preserve">Early each morning a scheduled task writes a brief. It reads the task workbook and the week’s calendar and proposes the day’s priorities. Its most useful move is the cross-check between the two. It catches a deadline that lands on a day already full of meetings, or a meeting that needs preparation nobody put on the list.</w:t>
       </w:r>
     </w:p>
     <w:p>
@@ -230,7 +230,7 @@
         <w:t xml:space="preserve"> </w:t>
       </w:r>
       <w:r>
-        <w:t xml:space="preserve">“Draft a reply to the dean’s office about the workshop; I’m saying yes but can’t do Thursday.”</w:t>
+        <w:t xml:space="preserve">“Turn these meeting notes into a one-page document with action items.”</w:t>
       </w:r>
       <w:r>
         <w:t xml:space="preserve"> </w:t>
@@ -264,7 +264,7 @@
         <w:contextualSpacing/>
       </w:pPr>
       <w:r>
-        <w:t xml:space="preserve">Email is drafted and never sent. Claude writes the draft to a file, and Ozzie reads it, edits it, and sends it from his own mail program.</w:t>
+        <w:t xml:space="preserve">Email stays separate. When a reply is wanted, the message goes into the chat, Claude drafts to a file, and the reply is rewritten and sent from his own mail program. The AI never sends.</w:t>
       </w:r>
     </w:p>
     <w:p>
@@ -312,7 +312,7 @@
         <w:contextualSpacing/>
       </w:pPr>
       <w:r>
-        <w:t xml:space="preserve">Corrections stick. When Claude gets something wrong, Ozzie says so and explains why, and Claude writes a memory so the mistake does not recur. After six months the setup holds about 270 memory files, most of them small corrections and project notes.</w:t>
+        <w:t xml:space="preserve">Corrections stick. When Claude gets something wrong, Ozzie says so and explains why, and Claude writes a memory so the mistake does not recur. After six months the setup holds a few hundred memory files, most of them small corrections and project notes.</w:t>
       </w:r>
     </w:p>
     <w:p>
@@ -423,23 +423,23 @@
         <w:contextualSpacing/>
       </w:pPr>
       <w:r>
-        <w:t xml:space="preserve">This is the most important step. Open Templates/Template - global CLAUDE.md, fill in the bracketed parts, and delete what does not apply. Then ask Claude to put it in place:</w:t>
-      </w:r>
-    </w:p>
-    <w:p>
-      <w:pPr>
-        <w:spacing w:before="0" w:after="0" w:line="240" w:lineRule="auto"/>
-        <w:contextualSpacing/>
-      </w:pPr>
-    </w:p>
-    <w:p>
-      <w:pPr>
-        <w:pStyle w:val="BodyText"/>
-        <w:spacing w:before="0" w:after="0" w:line="240" w:lineRule="auto"/>
-        <w:contextualSpacing/>
-      </w:pPr>
-      <w:r>
-        <w:t xml:space="preserve">“Copy Templates/Template - global CLAUDE.md to ~/.claude/CLAUDE.md and show me the result.”</w:t>
+        <w:t xml:space="preserve">This is the most important step. Open Templates/global-CLAUDE.md, fill in the bracketed parts, and delete what does not apply. Then ask Claude to put it in place:</w:t>
+      </w:r>
+    </w:p>
+    <w:p>
+      <w:pPr>
+        <w:spacing w:before="0" w:after="0" w:line="240" w:lineRule="auto"/>
+        <w:contextualSpacing/>
+      </w:pPr>
+    </w:p>
+    <w:p>
+      <w:pPr>
+        <w:pStyle w:val="BodyText"/>
+        <w:spacing w:before="0" w:after="0" w:line="240" w:lineRule="auto"/>
+        <w:contextualSpacing/>
+      </w:pPr>
+      <w:r>
+        <w:t xml:space="preserve">“Copy Templates/global-CLAUDE.md to ~/.claude/CLAUDE.md and show me the result.”</w:t>
       </w:r>
     </w:p>
     <w:p>
@@ -502,7 +502,7 @@
         <w:contextualSpacing/>
       </w:pPr>
       <w:r>
-        <w:t xml:space="preserve">The global file is about you. A folder CLAUDE.md is about the files: how the folder is organized, what the naming conventions mean, where the trackers live, and which folders are finished and should be left alone. Use Templates/Template - work folder CLAUDE.md and save it as CLAUDE.md at the top of your work folder. You can also have Claude draft it:</w:t>
+        <w:t xml:space="preserve">The global file is about you. A folder CLAUDE.md is about the files: how the folder is organized, what the naming conventions mean, where the trackers live, and which folders are finished and should be left alone. Use Templates/work-folder-CLAUDE.md and save it as CLAUDE.md at the top of your work folder. You can also have Claude draft it:</w:t>
       </w:r>
       <w:r>
         <w:t xml:space="preserve"> </w:t>
@@ -558,7 +558,7 @@
         <w:contextualSpacing/>
       </w:pPr>
       <w:r>
-        <w:t xml:space="preserve">Templates/Template - Projects Master.xlsx has a Task Queue, an Upcoming sheet of dated commitments with a live countdown, a Projects sheet, and a README sheet with the rules. Copy it into your work folder and tell Claude where it is:</w:t>
+        <w:t xml:space="preserve">Templates/Projects-Master.xlsx has a Task Queue, an Upcoming sheet of dated commitments with a live countdown, a Projects sheet, and a README sheet with the rules. Copy it into your work folder and tell Claude where it is:</w:t>
       </w:r>
       <w:r>
         <w:t xml:space="preserve"> </w:t>
@@ -634,7 +634,7 @@
         <w:contextualSpacing/>
       </w:pPr>
       <w:r>
-        <w:t xml:space="preserve">Connectors. Gmail, Google Calendar, Microsoft 365, and similar services are connected once on claude.ai (Settings, then Connectors), and they then appear in the Code tab automatically. You can also click the + beside the message box and choose Add connectors. On a Team or Enterprise plan, an administrator may have to add them for you.</w:t>
+        <w:t xml:space="preserve">Connectors. Google Calendar, Microsoft 365, Google Drive, and similar services are connected once on claude.ai (Settings, then Connectors), and they then appear in the Code tab automatically. You can also click the + beside the message box and choose Add connectors. On a Team or Enterprise plan, an administrator may have to add them for you.</w:t>
       </w:r>
     </w:p>
     <w:p>
@@ -648,7 +648,7 @@
         <w:contextualSpacing/>
       </w:pPr>
       <w:r>
-        <w:t xml:space="preserve">Claude in Chrome. A browser extension that lets Claude read pages and fill forms in your own Chrome, signed in as you. It is useful for web portals, webmail, and online forms. The desktop app also has its own built-in browser pane, but that one starts with no saved logins, so use Chrome for anything that needs you signed in.</w:t>
+        <w:t xml:space="preserve">Claude in Chrome. A browser extension that lets Claude read pages and fill forms in your own Chrome, signed in as you. It is useful for web portals and online forms. The desktop app also has its own built-in browser pane, but that one starts with no saved logins, so use Chrome for anything that needs you signed in.</w:t>
       </w:r>
     </w:p>
     <w:p>
@@ -678,7 +678,7 @@
         <w:contextualSpacing/>
       </w:pPr>
       <w:r>
-        <w:t xml:space="preserve">Connect one thing at a time, and only after the hard rules are in your global CLAUDE.md. A connected mail account means Claude could send mail; the rule is what stops it.</w:t>
+        <w:t xml:space="preserve">Connect one thing at a time, and only after the hard rules are in your global CLAUDE.md. Start with the calendar; it is what makes the morning brief and meeting preparation work. Email is a separate decision, taken up in section 6.</w:t>
       </w:r>
     </w:p>
     <w:p>
@@ -843,7 +843,7 @@
       </w:tblPr>
       <w:tblGrid>
         <w:gridCol w:w="2088"/>
-        <w:gridCol w:w="2952"/>
+        <w:gridCol w:w="2951"/>
         <w:gridCol w:w="2160"/>
         <w:gridCol w:w="2160"/>
       </w:tblGrid>
@@ -1341,7 +1341,7 @@
         <w:t xml:space="preserve"> </w:t>
       </w:r>
       <w:r>
-        <w:t xml:space="preserve">Templates/Examples - memory files.md shows what good memory files look like.</w:t>
+        <w:t xml:space="preserve">Templates/memory-examples.md shows what good memory files look like.</w:t>
       </w:r>
     </w:p>
     <w:p>
@@ -1397,23 +1397,23 @@
         <w:contextualSpacing/>
       </w:pPr>
       <w:r>
-        <w:t xml:space="preserve">Ozzie’s skills include one for grading in his own feedback voice, one for each journal he edits for (screening manuscripts and synthesizing reviews), one that checks the tone of delicate emails against three etiquette books, and one that answers questions from a local copy of his university’s policies. Each began as a job explained once in conversation.</w:t>
-      </w:r>
-    </w:p>
-    <w:p>
-      <w:pPr>
-        <w:spacing w:before="0" w:after="0" w:line="240" w:lineRule="auto"/>
-        <w:contextualSpacing/>
-      </w:pPr>
-    </w:p>
-    <w:p>
-      <w:pPr>
-        <w:pStyle w:val="BodyText"/>
-        <w:spacing w:before="0" w:after="0" w:line="240" w:lineRule="auto"/>
-        <w:contextualSpacing/>
-      </w:pPr>
-      <w:r>
-        <w:t xml:space="preserve">Templates/Template - skill (weekly-review)/SKILL.md is a working example you can install as it is.</w:t>
+        <w:t xml:space="preserve">Three of Ozzie’s: a grading skill that writes feedback in his own voice, one that scrubs AI-sounding phrasing out of a draft, and one that answers questions from a local copy of his university’s policies. Each began as a job explained once in conversation.</w:t>
+      </w:r>
+    </w:p>
+    <w:p>
+      <w:pPr>
+        <w:spacing w:before="0" w:after="0" w:line="240" w:lineRule="auto"/>
+        <w:contextualSpacing/>
+      </w:pPr>
+    </w:p>
+    <w:p>
+      <w:pPr>
+        <w:pStyle w:val="BodyText"/>
+        <w:spacing w:before="0" w:after="0" w:line="240" w:lineRule="auto"/>
+        <w:contextualSpacing/>
+      </w:pPr>
+      <w:r>
+        <w:t xml:space="preserve">Templates/weekly-review/SKILL.md is a working example you can install as it is.</w:t>
       </w:r>
     </w:p>
     <w:p>
@@ -1447,7 +1447,7 @@
         <w:t xml:space="preserve"> </w:t>
       </w:r>
       <w:r>
-        <w:t xml:space="preserve">“Set up a scheduled task that runs every weekday at 6 a.m. using the prompt in Templates/Template - morning brief task.md.”</w:t>
+        <w:t xml:space="preserve">“Set up a scheduled task that runs every weekday at 6 a.m. using the prompt in Templates/morning-brief.md.”</w:t>
       </w:r>
     </w:p>
     <w:p>
@@ -1479,7 +1479,7 @@
         <w:contextualSpacing/>
       </w:pPr>
       <w:r>
-        <w:t xml:space="preserve">Start with one, the morning brief. Add others only when you find yourself asking for the same thing on a schedule. Ozzie’s include a Friday review, a weekly LinkedIn draft for a journal he edits, a monthly refresh of his university policy library, and a weekly scan of family events in his city.</w:t>
+        <w:t xml:space="preserve">Start with one, the morning brief. Add others only when you find yourself asking for the same thing on a schedule. Others worth adding later: a Friday review, a weekly draft for a newsletter or social post, a monthly refresh of a policy library.</w:t>
       </w:r>
     </w:p>
     <w:p>
@@ -1524,7 +1524,7 @@
         <w:contextualSpacing/>
       </w:pPr>
       <w:r>
-        <w:t xml:space="preserve">Email is drafted and never sent. No AI sends or deletes your email unless you tell it to in the current conversation, naming the message. Approving the wording of a draft is not an instruction to send it. Claude writes the draft to a file, and you send it.</w:t>
+        <w:t xml:space="preserve">Email is drafted and never sent. This holds whether email is connected or a message is pasted into the chat. No AI sends or deletes your email unless you tell it to in the current conversation, naming the message. Approving the wording of a draft is not an instruction to send it. Claude writes the draft to a file, and you send it. Many people never connect email at all and lose little; section 6 says where the line is.</w:t>
       </w:r>
     </w:p>
     <w:p>
@@ -1764,7 +1764,7 @@
         <w:contextualSpacing/>
       </w:pPr>
       <w:r>
-        <w:t xml:space="preserve">Use Claude to check your writing. This is where it is strongest: facts, citations, consistency between versions, structure, and what a skeptical reader will object to. Prose it writes from scratch in your voice usually reads as machine-written, however good the instructions. Ozzie’s practice is to have it edit and diagnose his sentences while he writes the important ones himself. For routine material such as email, a voice profile helps (Templates/Template - voice profile.md).</w:t>
+        <w:t xml:space="preserve">Use Claude to check your writing. This is where it is strongest: facts, citations, consistency between versions, structure, and what a skeptical reader will object to. Prose it writes from scratch in your voice usually reads as machine-written, however good the instructions. Ozzie’s practice is to have it edit and diagnose his sentences while he writes the important ones himself. For routine material such as email, a voice profile helps (Templates/voice-profile.md).</w:t>
       </w:r>
     </w:p>
     <w:p>
@@ -1799,6 +1799,22 @@
       </w:r>
       <w:r>
         <w:t xml:space="preserve">Claude verifies when asked and often catches its own errors that way.</w:t>
+      </w:r>
+    </w:p>
+    <w:p>
+      <w:pPr>
+        <w:spacing w:before="0" w:after="0" w:line="240" w:lineRule="auto"/>
+        <w:contextualSpacing/>
+      </w:pPr>
+    </w:p>
+    <w:p>
+      <w:pPr>
+        <w:pStyle w:val="BodyText"/>
+        <w:spacing w:before="0" w:after="0" w:line="240" w:lineRule="auto"/>
+        <w:contextualSpacing/>
+      </w:pPr>
+      <w:r>
+        <w:t xml:space="preserve">Treat email as a decision, not a step. Many people run this setup for weeks without connecting email, and the task list, the documents, and the filing carry most of the value. The lightest route needs no connection: paste one message into the chat when you want a draft, and nothing else in your inbox is touched. Before connecting an inbox, think about the people who write to you. A student, a client, or an author whose manuscript you are handling did not agree to an AI reading their message; your employer may have a policy, and some publishers restrict AI anywhere in the review process. Keep student records, personnel matters, and manuscripts under review out of it, and say so in your global CLAUDE.md. Whatever route you take, the drafts are yours to rewrite; the sentences people receive should be the ones you chose to send.</w:t>
       </w:r>
     </w:p>
     <w:p>
@@ -1896,39 +1912,39 @@
         <w:contextualSpacing/>
       </w:pPr>
       <w:r>
-        <w:t xml:space="preserve">Day 4. Try email. Paste an email, or let Claude read it through a connector, and ask for a reply drafted to a file. Edit it and send it yourself, then tell Claude what you changed and why.</w:t>
-      </w:r>
-    </w:p>
-    <w:p>
-      <w:pPr>
-        <w:spacing w:before="0" w:after="0" w:line="240" w:lineRule="auto"/>
-        <w:contextualSpacing/>
-      </w:pPr>
-    </w:p>
-    <w:p>
-      <w:pPr>
-        <w:pStyle w:val="BodyText"/>
-        <w:spacing w:before="0" w:after="0" w:line="240" w:lineRule="auto"/>
-        <w:contextualSpacing/>
-      </w:pPr>
-      <w:r>
-        <w:t xml:space="preserve">Day 5. Have it tidy one messy folder, with anything redundant going to _to_review. Read the report it gives you.</w:t>
-      </w:r>
-    </w:p>
-    <w:p>
-      <w:pPr>
-        <w:spacing w:before="0" w:after="0" w:line="240" w:lineRule="auto"/>
-        <w:contextualSpacing/>
-      </w:pPr>
-    </w:p>
-    <w:p>
-      <w:pPr>
-        <w:pStyle w:val="BodyText"/>
-        <w:spacing w:before="0" w:after="0" w:line="240" w:lineRule="auto"/>
-        <w:contextualSpacing/>
-      </w:pPr>
-      <w:r>
-        <w:t xml:space="preserve">Week 2. Set up the morning brief. Turn one repeated job into a skill. Look in the memory folder to see what Claude has learned.</w:t>
+        <w:t xml:space="preserve">Day 4. Have it tidy one messy folder, with anything redundant going to _to_review. Read the report it gives you.</w:t>
+      </w:r>
+    </w:p>
+    <w:p>
+      <w:pPr>
+        <w:spacing w:before="0" w:after="0" w:line="240" w:lineRule="auto"/>
+        <w:contextualSpacing/>
+      </w:pPr>
+    </w:p>
+    <w:p>
+      <w:pPr>
+        <w:pStyle w:val="BodyText"/>
+        <w:spacing w:before="0" w:after="0" w:line="240" w:lineRule="auto"/>
+        <w:contextualSpacing/>
+      </w:pPr>
+      <w:r>
+        <w:t xml:space="preserve">Day 5. Connect your calendar and ask what the coming week looks like against the task list. Then ask it to prepare you for one meeting: who is coming, what you owe them, what to bring.</w:t>
+      </w:r>
+    </w:p>
+    <w:p>
+      <w:pPr>
+        <w:spacing w:before="0" w:after="0" w:line="240" w:lineRule="auto"/>
+        <w:contextualSpacing/>
+      </w:pPr>
+    </w:p>
+    <w:p>
+      <w:pPr>
+        <w:pStyle w:val="BodyText"/>
+        <w:spacing w:before="0" w:after="0" w:line="240" w:lineRule="auto"/>
+        <w:contextualSpacing/>
+      </w:pPr>
+      <w:r>
+        <w:t xml:space="preserve">Week 2. Set up the morning brief. Turn one repeated job into a skill. Look in the memory folder to see what Claude has learned. Email can wait until you decide you want it; see section 6.</w:t>
       </w:r>
     </w:p>
     <w:p>
@@ -2172,109 +2188,109 @@
         <w:contextualSpacing/>
       </w:pPr>
       <w:r>
-        <w:t xml:space="preserve">Template - global CLAUDE.md. Your standing instructions for every session. Fill in the brackets and copy it to ~/.claude/CLAUDE.md.</w:t>
-      </w:r>
-    </w:p>
-    <w:p>
-      <w:pPr>
-        <w:spacing w:before="0" w:after="0" w:line="240" w:lineRule="auto"/>
-        <w:contextualSpacing/>
-      </w:pPr>
-    </w:p>
-    <w:p>
-      <w:pPr>
-        <w:pStyle w:val="BodyText"/>
-        <w:spacing w:before="0" w:after="0" w:line="240" w:lineRule="auto"/>
-        <w:contextualSpacing/>
-      </w:pPr>
-      <w:r>
-        <w:t xml:space="preserve">Template - work folder CLAUDE.md. A map of your work folder for Claude. Save it as CLAUDE.md at the top of the folder.</w:t>
-      </w:r>
-    </w:p>
-    <w:p>
-      <w:pPr>
-        <w:spacing w:before="0" w:after="0" w:line="240" w:lineRule="auto"/>
-        <w:contextualSpacing/>
-      </w:pPr>
-    </w:p>
-    <w:p>
-      <w:pPr>
-        <w:pStyle w:val="BodyText"/>
-        <w:spacing w:before="0" w:after="0" w:line="240" w:lineRule="auto"/>
-        <w:contextualSpacing/>
-      </w:pPr>
-      <w:r>
-        <w:t xml:space="preserve">Template - voice profile.md. Optional. A structure for describing how you write, for when you want Claude to draft in your voice. It is easiest to build by having Claude interview you, and the template explains how.</w:t>
-      </w:r>
-    </w:p>
-    <w:p>
-      <w:pPr>
-        <w:spacing w:before="0" w:after="0" w:line="240" w:lineRule="auto"/>
-        <w:contextualSpacing/>
-      </w:pPr>
-    </w:p>
-    <w:p>
-      <w:pPr>
-        <w:pStyle w:val="BodyText"/>
-        <w:spacing w:before="0" w:after="0" w:line="240" w:lineRule="auto"/>
-        <w:contextualSpacing/>
-      </w:pPr>
-      <w:r>
-        <w:t xml:space="preserve">Examples - memory files.md. What memory files and the MEMORY.md index look like, with one example of each kind. Claude creates these itself; the examples show what good ones look like so you can ask for them.</w:t>
-      </w:r>
-    </w:p>
-    <w:p>
-      <w:pPr>
-        <w:spacing w:before="0" w:after="0" w:line="240" w:lineRule="auto"/>
-        <w:contextualSpacing/>
-      </w:pPr>
-    </w:p>
-    <w:p>
-      <w:pPr>
-        <w:pStyle w:val="BodyText"/>
-        <w:spacing w:before="0" w:after="0" w:line="240" w:lineRule="auto"/>
-        <w:contextualSpacing/>
-      </w:pPr>
-      <w:r>
-        <w:t xml:space="preserve">Template - skill (weekly-review). A complete Friday review skill. Ask Claude to install it:</w:t>
+        <w:t xml:space="preserve">Templates/global-CLAUDE.md. Your standing instructions for every session. Fill in the brackets and copy it to ~/.claude/CLAUDE.md.</w:t>
+      </w:r>
+    </w:p>
+    <w:p>
+      <w:pPr>
+        <w:spacing w:before="0" w:after="0" w:line="240" w:lineRule="auto"/>
+        <w:contextualSpacing/>
+      </w:pPr>
+    </w:p>
+    <w:p>
+      <w:pPr>
+        <w:pStyle w:val="BodyText"/>
+        <w:spacing w:before="0" w:after="0" w:line="240" w:lineRule="auto"/>
+        <w:contextualSpacing/>
+      </w:pPr>
+      <w:r>
+        <w:t xml:space="preserve">Templates/work-folder-CLAUDE.md. A map of your work folder for Claude. Save it as CLAUDE.md at the top of the folder.</w:t>
+      </w:r>
+    </w:p>
+    <w:p>
+      <w:pPr>
+        <w:spacing w:before="0" w:after="0" w:line="240" w:lineRule="auto"/>
+        <w:contextualSpacing/>
+      </w:pPr>
+    </w:p>
+    <w:p>
+      <w:pPr>
+        <w:pStyle w:val="BodyText"/>
+        <w:spacing w:before="0" w:after="0" w:line="240" w:lineRule="auto"/>
+        <w:contextualSpacing/>
+      </w:pPr>
+      <w:r>
+        <w:t xml:space="preserve">Templates/voice-profile.md. Optional. A structure for describing how you write, for when you want Claude to draft in your voice. It is easiest to build by having Claude interview you, and the template explains how.</w:t>
+      </w:r>
+    </w:p>
+    <w:p>
+      <w:pPr>
+        <w:spacing w:before="0" w:after="0" w:line="240" w:lineRule="auto"/>
+        <w:contextualSpacing/>
+      </w:pPr>
+    </w:p>
+    <w:p>
+      <w:pPr>
+        <w:pStyle w:val="BodyText"/>
+        <w:spacing w:before="0" w:after="0" w:line="240" w:lineRule="auto"/>
+        <w:contextualSpacing/>
+      </w:pPr>
+      <w:r>
+        <w:t xml:space="preserve">Templates/memory-examples.md. What memory files and the MEMORY.md index look like, with one example of each kind. Claude creates these itself; the examples show what good ones look like so you can ask for them.</w:t>
+      </w:r>
+    </w:p>
+    <w:p>
+      <w:pPr>
+        <w:spacing w:before="0" w:after="0" w:line="240" w:lineRule="auto"/>
+        <w:contextualSpacing/>
+      </w:pPr>
+    </w:p>
+    <w:p>
+      <w:pPr>
+        <w:pStyle w:val="BodyText"/>
+        <w:spacing w:before="0" w:after="0" w:line="240" w:lineRule="auto"/>
+        <w:contextualSpacing/>
+      </w:pPr>
+      <w:r>
+        <w:t xml:space="preserve">Templates/weekly-review/SKILL.md. A complete Friday review skill. Ask Claude to install it:</w:t>
       </w:r>
       <w:r>
         <w:t xml:space="preserve"> </w:t>
       </w:r>
       <w:r>
-        <w:t xml:space="preserve">“Copy the SKILL.md in Templates/Template - skill (weekly-review) to ~/.claude/skills/weekly-review/SKILL.md.”</w:t>
-      </w:r>
-    </w:p>
-    <w:p>
-      <w:pPr>
-        <w:spacing w:before="0" w:after="0" w:line="240" w:lineRule="auto"/>
-        <w:contextualSpacing/>
-      </w:pPr>
-    </w:p>
-    <w:p>
-      <w:pPr>
-        <w:pStyle w:val="BodyText"/>
-        <w:spacing w:before="0" w:after="0" w:line="240" w:lineRule="auto"/>
-        <w:contextualSpacing/>
-      </w:pPr>
-      <w:r>
-        <w:t xml:space="preserve">Template - morning brief task.md. The prompt for a daily scheduled brief, with setup instructions at the top.</w:t>
-      </w:r>
-    </w:p>
-    <w:p>
-      <w:pPr>
-        <w:spacing w:before="0" w:after="0" w:line="240" w:lineRule="auto"/>
-        <w:contextualSpacing/>
-      </w:pPr>
-    </w:p>
-    <w:p>
-      <w:pPr>
-        <w:pStyle w:val="BodyText"/>
-        <w:spacing w:before="0" w:after="0" w:line="240" w:lineRule="auto"/>
-        <w:contextualSpacing/>
-      </w:pPr>
-      <w:r>
-        <w:t xml:space="preserve">Template - Projects Master.xlsx. A task workbook with Task Queue, Upcoming, Projects, and README sheets. The example rows show the format; delete them once your own tasks are in.</w:t>
+        <w:t xml:space="preserve">“Copy the SKILL.md in Templates/weekly-review to ~/.claude/skills/weekly-review/SKILL.md.”</w:t>
+      </w:r>
+    </w:p>
+    <w:p>
+      <w:pPr>
+        <w:spacing w:before="0" w:after="0" w:line="240" w:lineRule="auto"/>
+        <w:contextualSpacing/>
+      </w:pPr>
+    </w:p>
+    <w:p>
+      <w:pPr>
+        <w:pStyle w:val="BodyText"/>
+        <w:spacing w:before="0" w:after="0" w:line="240" w:lineRule="auto"/>
+        <w:contextualSpacing/>
+      </w:pPr>
+      <w:r>
+        <w:t xml:space="preserve">Templates/morning-brief.md. The prompt for a daily scheduled brief, with setup instructions at the top. Email is an optional step, off until you add it.</w:t>
+      </w:r>
+    </w:p>
+    <w:p>
+      <w:pPr>
+        <w:spacing w:before="0" w:after="0" w:line="240" w:lineRule="auto"/>
+        <w:contextualSpacing/>
+      </w:pPr>
+    </w:p>
+    <w:p>
+      <w:pPr>
+        <w:pStyle w:val="BodyText"/>
+        <w:spacing w:before="0" w:after="0" w:line="240" w:lineRule="auto"/>
+        <w:contextualSpacing/>
+      </w:pPr>
+      <w:r>
+        <w:t xml:space="preserve">Projects-Master.xlsx. A task workbook with Task Queue, Upcoming, Projects, and README sheets. The example rows show the format; delete them once your own tasks are in.</w:t>
       </w:r>
     </w:p>
     <w:p>

</xml_diff>

<commit_message>
Add what goes in and what stays out, and Chrome setup steps
Co-Authored-By: Claude Fable 5.1 <noreply@anthropic.com>
</commit_message>
<xml_diff>
--- a/GUIDE.docx
+++ b/GUIDE.docx
@@ -367,7 +367,39 @@
         <w:contextualSpacing/>
       </w:pPr>
       <w:r>
-        <w:t xml:space="preserve">If your employer provides Claude, find out which plan it is and whether there is a policy on what data you may use with it. Many universities and companies restrict confidential records such as student records, personnel files, patient data, and licensed datasets. Settle this before you point Claude at those folders.</w:t>
+        <w:t xml:space="preserve">Two things to settle before you point Claude at anything.</w:t>
+      </w:r>
+    </w:p>
+    <w:p>
+      <w:pPr>
+        <w:spacing w:before="0" w:after="0" w:line="240" w:lineRule="auto"/>
+        <w:contextualSpacing/>
+      </w:pPr>
+    </w:p>
+    <w:p>
+      <w:pPr>
+        <w:pStyle w:val="BodyText"/>
+        <w:spacing w:before="0" w:after="0" w:line="240" w:lineRule="auto"/>
+        <w:contextualSpacing/>
+      </w:pPr>
+      <w:r>
+        <w:t xml:space="preserve">Your organization’s rules come first. Most universities and companies now have a policy on AI tools, usually from IT, research ethics, or HR, and it governs everything in this guide. Find it before you begin, and if there is none, ask who decides. Nothing here overrides it.</w:t>
+      </w:r>
+    </w:p>
+    <w:p>
+      <w:pPr>
+        <w:spacing w:before="0" w:after="0" w:line="240" w:lineRule="auto"/>
+        <w:contextualSpacing/>
+      </w:pPr>
+    </w:p>
+    <w:p>
+      <w:pPr>
+        <w:pStyle w:val="BodyText"/>
+        <w:spacing w:before="0" w:after="0" w:line="240" w:lineRule="auto"/>
+        <w:contextualSpacing/>
+      </w:pPr>
+      <w:r>
+        <w:t xml:space="preserve">Then apply one test to anything you are about to give Claude: do you have permission to share it, and would you be comfortable if it leaked? If the answer to either is no, keep it out. Claude Code works on files on your computer, but the model itself runs on Anthropic’s servers, so what Claude reads leaves your machine. How long it is kept and what it may be used for depend on your plan and your settings, so read them. Be most careful with what other people have entrusted to you: student work and records, research participants’ data, personnel and salary files, client records, manuscripts under review, and anything covered by a data use agreement or a confidentiality clause. Those people did not agree to an AI reading their material. The global CLAUDE.md template has a rule for exactly this; write your own list into it.</w:t>
       </w:r>
     </w:p>
     <w:p>
@@ -662,7 +694,7 @@
         <w:contextualSpacing/>
       </w:pPr>
       <w:r>
-        <w:t xml:space="preserve">Mac apps. On a Mac, Claude can read Apple Calendar and Apple Mail through AppleScript, which it writes and runs itself. macOS asks you to grant permission the first time.</w:t>
+        <w:t xml:space="preserve">Mac apps. On a Mac, Claude can read Apple Calendar through AppleScript, which it writes and runs itself. macOS asks you to grant permission the first time.</w:t>
       </w:r>
     </w:p>
     <w:p>
@@ -678,35 +710,7 @@
         <w:contextualSpacing/>
       </w:pPr>
       <w:r>
-        <w:t xml:space="preserve">Connect one thing at a time, and only after the hard rules are in your global CLAUDE.md. Start with the calendar; it is what makes the morning brief and meeting preparation work. Email is a separate decision, taken up in section 6.</w:t>
-      </w:r>
-    </w:p>
-    <w:p>
-      <w:pPr>
-        <w:spacing w:before="0" w:after="0" w:line="240" w:lineRule="auto"/>
-        <w:contextualSpacing/>
-      </w:pPr>
-    </w:p>
-    <w:bookmarkEnd w:id="16"/>
-    <w:bookmarkStart w:id="17" w:name="step-7-choose-a-permission-mode"/>
-    <w:p>
-      <w:pPr>
-        <w:pStyle w:val="Heading2"/>
-        <w:spacing w:before="0" w:after="0" w:line="240" w:lineRule="auto"/>
-        <w:contextualSpacing/>
-      </w:pPr>
-      <w:r>
-        <w:t xml:space="preserve">Step 7: Choose a permission mode</w:t>
-      </w:r>
-    </w:p>
-    <w:p>
-      <w:pPr>
-        <w:pStyle w:val="FirstParagraph"/>
-        <w:spacing w:before="0" w:after="0" w:line="240" w:lineRule="auto"/>
-        <w:contextualSpacing/>
-      </w:pPr>
-      <w:r>
-        <w:t xml:space="preserve">The permission mode decides how often Claude stops to ask you. In the desktop app you change it with the mode selector just below the message box, and the app remembers your choice for each folder. The modes you will use are these.</w:t>
+        <w:t xml:space="preserve">To set up Claude in Chrome:</w:t>
       </w:r>
     </w:p>
     <w:p>
@@ -726,7 +730,7 @@
         <w:contextualSpacing/>
       </w:pPr>
       <w:r>
-        <w:t xml:space="preserve">Manual. Claude asks before it edits a file or runs a command. Start here.</w:t>
+        <w:t xml:space="preserve">Install the Claude in Chrome extension from the Chrome Web Store and sign in to it with the same Claude account. It works in Chrome or Edge and needs a Pro, Max, Team, or Enterprise plan.</w:t>
       </w:r>
     </w:p>
     <w:p>
@@ -740,7 +744,34 @@
         <w:contextualSpacing/>
       </w:pPr>
       <w:r>
-        <w:t xml:space="preserve">Accept edits. Claude edits files without asking but still asks before other actions. Move to this after a week or so; it saves a great deal of clicking.</w:t>
+        <w:t xml:space="preserve">In the desktop app, Claude uses the extension whenever a task needs the browser. In the Terminal, start a session with</w:t>
+      </w:r>
+      <w:r>
+        <w:t xml:space="preserve"> </w:t>
+      </w:r>
+      <w:r>
+        <w:rPr>
+          <w:rStyle w:val="VerbatimChar"/>
+        </w:rPr>
+        <w:t xml:space="preserve">claude --chrome</w:t>
+      </w:r>
+      <w:r>
+        <w:t xml:space="preserve">, or type</w:t>
+      </w:r>
+      <w:r>
+        <w:t xml:space="preserve"> </w:t>
+      </w:r>
+      <w:r>
+        <w:rPr>
+          <w:rStyle w:val="VerbatimChar"/>
+        </w:rPr>
+        <w:t xml:space="preserve">/chrome</w:t>
+      </w:r>
+      <w:r>
+        <w:t xml:space="preserve"> </w:t>
+      </w:r>
+      <w:r>
+        <w:t xml:space="preserve">to check the connection and turn it on by default.</w:t>
       </w:r>
     </w:p>
     <w:p>
@@ -754,7 +785,7 @@
         <w:contextualSpacing/>
       </w:pPr>
       <w:r>
-        <w:t xml:space="preserve">Plan. Claude investigates and proposes a plan, and changes nothing until you approve it. Useful for large jobs such as reorganizing a folder.</w:t>
+        <w:t xml:space="preserve">Keep the Chrome window visible and watch it work. The extension stops at sign-in pages and CAPTCHAs and hands those to you. You can allow or block individual sites in the extension’s settings.</w:t>
       </w:r>
     </w:p>
     <w:p>
@@ -763,6 +794,148 @@
         <w:numPr>
           <w:ilvl w:val="0"/>
           <w:numId w:val="1002"/>
+        </w:numPr>
+        <w:spacing w:before="0" w:after="0" w:line="240" w:lineRule="auto"/>
+        <w:contextualSpacing/>
+      </w:pPr>
+      <w:r>
+        <w:t xml:space="preserve">Hold the browser rule: fill, never submit. Ask Claude to say what it filled, what it guessed, and what it left blank, then press the final button yourself.</w:t>
+      </w:r>
+    </w:p>
+    <w:p>
+      <w:pPr>
+        <w:pStyle w:val="Compact"/>
+        <w:numPr>
+          <w:ilvl w:val="0"/>
+          <w:numId w:val="1002"/>
+        </w:numPr>
+        <w:spacing w:before="0" w:after="0" w:line="240" w:lineRule="auto"/>
+        <w:contextualSpacing/>
+      </w:pPr>
+      <w:r>
+        <w:t xml:space="preserve">Everything on a page Claude opens, Claude reads. Treat a page inside a signed-in portal the way you would treat a document, and keep the same things out of it.</w:t>
+      </w:r>
+    </w:p>
+    <w:p>
+      <w:pPr>
+        <w:spacing w:before="0" w:after="0" w:line="240" w:lineRule="auto"/>
+        <w:contextualSpacing/>
+      </w:pPr>
+    </w:p>
+    <w:p>
+      <w:pPr>
+        <w:pStyle w:val="FirstParagraph"/>
+        <w:spacing w:before="0" w:after="0" w:line="240" w:lineRule="auto"/>
+        <w:contextualSpacing/>
+      </w:pPr>
+      <w:r>
+        <w:t xml:space="preserve">A first task to try:</w:t>
+      </w:r>
+      <w:r>
+        <w:t xml:space="preserve"> </w:t>
+      </w:r>
+      <w:r>
+        <w:t xml:space="preserve">“Open the travel reimbursement form in Chrome and fill it in from the receipts in Admin/Expenses/October. Stop before submitting and tell me what you filled, what you guessed, and what you left blank.”</w:t>
+      </w:r>
+    </w:p>
+    <w:p>
+      <w:pPr>
+        <w:spacing w:before="0" w:after="0" w:line="240" w:lineRule="auto"/>
+        <w:contextualSpacing/>
+      </w:pPr>
+    </w:p>
+    <w:p>
+      <w:pPr>
+        <w:pStyle w:val="BodyText"/>
+        <w:spacing w:before="0" w:after="0" w:line="240" w:lineRule="auto"/>
+        <w:contextualSpacing/>
+      </w:pPr>
+      <w:r>
+        <w:t xml:space="preserve">Connect one thing at a time, and only after the hard rules are in your global CLAUDE.md. Start with the calendar; it is what makes the morning brief and meeting preparation work. Email comes last; section 6 says where the line is.</w:t>
+      </w:r>
+    </w:p>
+    <w:p>
+      <w:pPr>
+        <w:spacing w:before="0" w:after="0" w:line="240" w:lineRule="auto"/>
+        <w:contextualSpacing/>
+      </w:pPr>
+    </w:p>
+    <w:bookmarkEnd w:id="16"/>
+    <w:bookmarkStart w:id="17" w:name="step-7-choose-a-permission-mode"/>
+    <w:p>
+      <w:pPr>
+        <w:pStyle w:val="Heading2"/>
+        <w:spacing w:before="0" w:after="0" w:line="240" w:lineRule="auto"/>
+        <w:contextualSpacing/>
+      </w:pPr>
+      <w:r>
+        <w:t xml:space="preserve">Step 7: Choose a permission mode</w:t>
+      </w:r>
+    </w:p>
+    <w:p>
+      <w:pPr>
+        <w:pStyle w:val="FirstParagraph"/>
+        <w:spacing w:before="0" w:after="0" w:line="240" w:lineRule="auto"/>
+        <w:contextualSpacing/>
+      </w:pPr>
+      <w:r>
+        <w:t xml:space="preserve">The permission mode decides how often Claude stops to ask you. In the desktop app you change it with the mode selector just below the message box, and the app remembers your choice for each folder. The modes you will use are these.</w:t>
+      </w:r>
+    </w:p>
+    <w:p>
+      <w:pPr>
+        <w:spacing w:before="0" w:after="0" w:line="240" w:lineRule="auto"/>
+        <w:contextualSpacing/>
+      </w:pPr>
+    </w:p>
+    <w:p>
+      <w:pPr>
+        <w:pStyle w:val="Compact"/>
+        <w:numPr>
+          <w:ilvl w:val="0"/>
+          <w:numId w:val="1003"/>
+        </w:numPr>
+        <w:spacing w:before="0" w:after="0" w:line="240" w:lineRule="auto"/>
+        <w:contextualSpacing/>
+      </w:pPr>
+      <w:r>
+        <w:t xml:space="preserve">Manual. Claude asks before it edits a file or runs a command. Start here.</w:t>
+      </w:r>
+    </w:p>
+    <w:p>
+      <w:pPr>
+        <w:pStyle w:val="Compact"/>
+        <w:numPr>
+          <w:ilvl w:val="0"/>
+          <w:numId w:val="1003"/>
+        </w:numPr>
+        <w:spacing w:before="0" w:after="0" w:line="240" w:lineRule="auto"/>
+        <w:contextualSpacing/>
+      </w:pPr>
+      <w:r>
+        <w:t xml:space="preserve">Accept edits. Claude edits files without asking but still asks before other actions. Move to this after a week or so; it saves a great deal of clicking.</w:t>
+      </w:r>
+    </w:p>
+    <w:p>
+      <w:pPr>
+        <w:pStyle w:val="Compact"/>
+        <w:numPr>
+          <w:ilvl w:val="0"/>
+          <w:numId w:val="1003"/>
+        </w:numPr>
+        <w:spacing w:before="0" w:after="0" w:line="240" w:lineRule="auto"/>
+        <w:contextualSpacing/>
+      </w:pPr>
+      <w:r>
+        <w:t xml:space="preserve">Plan. Claude investigates and proposes a plan, and changes nothing until you approve it. Useful for large jobs such as reorganizing a folder.</w:t>
+      </w:r>
+    </w:p>
+    <w:p>
+      <w:pPr>
+        <w:pStyle w:val="Compact"/>
+        <w:numPr>
+          <w:ilvl w:val="0"/>
+          <w:numId w:val="1003"/>
         </w:numPr>
         <w:spacing w:before="0" w:after="0" w:line="240" w:lineRule="auto"/>
         <w:contextualSpacing/>
@@ -1814,7 +1987,7 @@
         <w:contextualSpacing/>
       </w:pPr>
       <w:r>
-        <w:t xml:space="preserve">Treat email as a decision, not a step. Many people run this setup for weeks without connecting email, and the task list, the documents, and the filing carry most of the value. The lightest route needs no connection: paste one message into the chat when you want a draft, and nothing else in your inbox is touched. Before connecting an inbox, think about the people who write to you. A student, a client, or an author whose manuscript you are handling did not agree to an AI reading their message; your employer may have a policy, and some publishers restrict AI anywhere in the review process. Keep student records, personnel matters, and manuscripts under review out of it, and say so in your global CLAUDE.md. Whatever route you take, the drafts are yours to rewrite; the sentences people receive should be the ones you chose to send.</w:t>
+        <w:t xml:space="preserve">Leave email for last. Many people run this setup for weeks without connecting email, and the task list, the documents, and the filing carry most of the value. The lightest route needs no connection: paste one message into the chat when you want a draft, and nothing else in your inbox is touched. Before connecting an inbox, think about the people who write to you. A student, a client, or an author whose manuscript you are handling did not agree to an AI reading their message; your employer may have a policy, and some publishers restrict AI anywhere in the review process. Keep student records, personnel matters, and manuscripts under review out of it, and say so in your global CLAUDE.md. Whatever route you take, the drafts are yours to rewrite; the sentences people receive should be the ones you chose to send.</w:t>
       </w:r>
     </w:p>
     <w:p>
@@ -1986,7 +2159,7 @@
         <w:pStyle w:val="Compact"/>
         <w:numPr>
           <w:ilvl w:val="0"/>
-          <w:numId w:val="1003"/>
+          <w:numId w:val="1004"/>
         </w:numPr>
         <w:spacing w:before="0" w:after="0" w:line="240" w:lineRule="auto"/>
         <w:contextualSpacing/>
@@ -2000,7 +2173,7 @@
         <w:pStyle w:val="Compact"/>
         <w:numPr>
           <w:ilvl w:val="0"/>
-          <w:numId w:val="1003"/>
+          <w:numId w:val="1004"/>
         </w:numPr>
         <w:spacing w:before="0" w:after="0" w:line="240" w:lineRule="auto"/>
         <w:contextualSpacing/>
@@ -2014,7 +2187,7 @@
         <w:pStyle w:val="Compact"/>
         <w:numPr>
           <w:ilvl w:val="0"/>
-          <w:numId w:val="1003"/>
+          <w:numId w:val="1004"/>
         </w:numPr>
         <w:spacing w:before="0" w:after="0" w:line="240" w:lineRule="auto"/>
         <w:contextualSpacing/>
@@ -2028,7 +2201,7 @@
         <w:pStyle w:val="Compact"/>
         <w:numPr>
           <w:ilvl w:val="0"/>
-          <w:numId w:val="1003"/>
+          <w:numId w:val="1004"/>
         </w:numPr>
         <w:spacing w:before="0" w:after="0" w:line="240" w:lineRule="auto"/>
         <w:contextualSpacing/>
@@ -2042,7 +2215,7 @@
         <w:pStyle w:val="Compact"/>
         <w:numPr>
           <w:ilvl w:val="0"/>
-          <w:numId w:val="1003"/>
+          <w:numId w:val="1004"/>
         </w:numPr>
         <w:spacing w:before="0" w:after="0" w:line="240" w:lineRule="auto"/>
         <w:contextualSpacing/>
@@ -2056,7 +2229,7 @@
         <w:pStyle w:val="Compact"/>
         <w:numPr>
           <w:ilvl w:val="0"/>
-          <w:numId w:val="1003"/>
+          <w:numId w:val="1004"/>
         </w:numPr>
         <w:spacing w:before="0" w:after="0" w:line="240" w:lineRule="auto"/>
         <w:contextualSpacing/>
@@ -2070,7 +2243,7 @@
         <w:pStyle w:val="Compact"/>
         <w:numPr>
           <w:ilvl w:val="0"/>
-          <w:numId w:val="1003"/>
+          <w:numId w:val="1004"/>
         </w:numPr>
         <w:spacing w:before="0" w:after="0" w:line="240" w:lineRule="auto"/>
         <w:contextualSpacing/>
@@ -2084,7 +2257,7 @@
         <w:pStyle w:val="Compact"/>
         <w:numPr>
           <w:ilvl w:val="0"/>
-          <w:numId w:val="1003"/>
+          <w:numId w:val="1004"/>
         </w:numPr>
         <w:spacing w:before="0" w:after="0" w:line="240" w:lineRule="auto"/>
         <w:contextualSpacing/>
@@ -2098,7 +2271,7 @@
         <w:pStyle w:val="Compact"/>
         <w:numPr>
           <w:ilvl w:val="0"/>
-          <w:numId w:val="1003"/>
+          <w:numId w:val="1004"/>
         </w:numPr>
         <w:spacing w:before="0" w:after="0" w:line="240" w:lineRule="auto"/>
         <w:contextualSpacing/>
@@ -2112,7 +2285,7 @@
         <w:pStyle w:val="Compact"/>
         <w:numPr>
           <w:ilvl w:val="0"/>
-          <w:numId w:val="1003"/>
+          <w:numId w:val="1004"/>
         </w:numPr>
         <w:spacing w:before="0" w:after="0" w:line="240" w:lineRule="auto"/>
         <w:contextualSpacing/>
@@ -2126,7 +2299,7 @@
         <w:pStyle w:val="Compact"/>
         <w:numPr>
           <w:ilvl w:val="0"/>
-          <w:numId w:val="1003"/>
+          <w:numId w:val="1004"/>
         </w:numPr>
         <w:spacing w:before="0" w:after="0" w:line="240" w:lineRule="auto"/>
         <w:contextualSpacing/>
@@ -2140,7 +2313,7 @@
         <w:pStyle w:val="Compact"/>
         <w:numPr>
           <w:ilvl w:val="0"/>
-          <w:numId w:val="1003"/>
+          <w:numId w:val="1004"/>
         </w:numPr>
         <w:spacing w:before="0" w:after="0" w:line="240" w:lineRule="auto"/>
         <w:contextualSpacing/>
@@ -2154,7 +2327,7 @@
         <w:pStyle w:val="Compact"/>
         <w:numPr>
           <w:ilvl w:val="0"/>
-          <w:numId w:val="1003"/>
+          <w:numId w:val="1004"/>
         </w:numPr>
         <w:spacing w:before="0" w:after="0" w:line="240" w:lineRule="auto"/>
         <w:contextualSpacing/>
@@ -2629,6 +2802,91 @@
       </w:rPr>
     </w:lvl>
   </w:abstractNum>
+  <w:abstractNum w:abstractNumId="99411">
+    <w:nsid w:val="00A99411"/>
+    <w:multiLevelType w:val="multilevel"/>
+    <w:lvl w:ilvl="0">
+      <w:start w:val="1"/>
+      <w:numFmt w:val="decimal"/>
+      <w:lvlText w:val="%1."/>
+      <w:lvlJc w:val="left"/>
+      <w:pPr>
+        <w:ind w:left="720" w:hanging="360"/>
+      </w:pPr>
+    </w:lvl>
+    <w:lvl w:ilvl="1">
+      <w:start w:val="1"/>
+      <w:numFmt w:val="decimal"/>
+      <w:lvlText w:val="%2."/>
+      <w:lvlJc w:val="left"/>
+      <w:pPr>
+        <w:ind w:left="1440" w:hanging="360"/>
+      </w:pPr>
+    </w:lvl>
+    <w:lvl w:ilvl="2">
+      <w:start w:val="1"/>
+      <w:numFmt w:val="decimal"/>
+      <w:lvlText w:val="%3."/>
+      <w:lvlJc w:val="left"/>
+      <w:pPr>
+        <w:ind w:left="2160" w:hanging="360"/>
+      </w:pPr>
+    </w:lvl>
+    <w:lvl w:ilvl="3">
+      <w:start w:val="1"/>
+      <w:numFmt w:val="decimal"/>
+      <w:lvlText w:val="%4."/>
+      <w:lvlJc w:val="left"/>
+      <w:pPr>
+        <w:ind w:left="2880" w:hanging="360"/>
+      </w:pPr>
+    </w:lvl>
+    <w:lvl w:ilvl="4">
+      <w:start w:val="1"/>
+      <w:numFmt w:val="decimal"/>
+      <w:lvlText w:val="%5."/>
+      <w:lvlJc w:val="left"/>
+      <w:pPr>
+        <w:ind w:left="3600" w:hanging="360"/>
+      </w:pPr>
+    </w:lvl>
+    <w:lvl w:ilvl="5">
+      <w:start w:val="1"/>
+      <w:numFmt w:val="decimal"/>
+      <w:lvlText w:val="%6."/>
+      <w:lvlJc w:val="left"/>
+      <w:pPr>
+        <w:ind w:left="4320" w:hanging="360"/>
+      </w:pPr>
+    </w:lvl>
+    <w:lvl w:ilvl="6">
+      <w:start w:val="1"/>
+      <w:numFmt w:val="decimal"/>
+      <w:lvlText w:val="%7."/>
+      <w:lvlJc w:val="left"/>
+      <w:pPr>
+        <w:ind w:left="5040" w:hanging="360"/>
+      </w:pPr>
+    </w:lvl>
+    <w:lvl w:ilvl="7">
+      <w:start w:val="1"/>
+      <w:numFmt w:val="decimal"/>
+      <w:lvlText w:val="%8."/>
+      <w:lvlJc w:val="left"/>
+      <w:pPr>
+        <w:ind w:left="5760" w:hanging="360"/>
+      </w:pPr>
+    </w:lvl>
+    <w:lvl w:ilvl="8">
+      <w:start w:val="1"/>
+      <w:numFmt w:val="decimal"/>
+      <w:lvlText w:val="%9."/>
+      <w:lvlJc w:val="left"/>
+      <w:pPr>
+        <w:ind w:left="6480" w:hanging="360"/>
+      </w:pPr>
+    </w:lvl>
+  </w:abstractNum>
   <w:num w:numId="1000">
     <w:abstractNumId w:val="990"/>
   </w:num>
@@ -2636,9 +2894,39 @@
     <w:abstractNumId w:val="991"/>
   </w:num>
   <w:num w:numId="1002">
+    <w:abstractNumId w:val="99411"/>
+    <w:lvlOverride w:ilvl="0">
+      <w:startOverride w:val="1"/>
+    </w:lvlOverride>
+    <w:lvlOverride w:ilvl="1">
+      <w:startOverride w:val="1"/>
+    </w:lvlOverride>
+    <w:lvlOverride w:ilvl="2">
+      <w:startOverride w:val="1"/>
+    </w:lvlOverride>
+    <w:lvlOverride w:ilvl="3">
+      <w:startOverride w:val="1"/>
+    </w:lvlOverride>
+    <w:lvlOverride w:ilvl="4">
+      <w:startOverride w:val="1"/>
+    </w:lvlOverride>
+    <w:lvlOverride w:ilvl="5">
+      <w:startOverride w:val="1"/>
+    </w:lvlOverride>
+    <w:lvlOverride w:ilvl="6">
+      <w:startOverride w:val="1"/>
+    </w:lvlOverride>
+    <w:lvlOverride w:ilvl="7">
+      <w:startOverride w:val="1"/>
+    </w:lvlOverride>
+    <w:lvlOverride w:ilvl="8">
+      <w:startOverride w:val="1"/>
+    </w:lvlOverride>
+  </w:num>
+  <w:num w:numId="1003">
     <w:abstractNumId w:val="991"/>
   </w:num>
-  <w:num w:numId="1003">
+  <w:num w:numId="1004">
     <w:abstractNumId w:val="991"/>
   </w:num>
 </w:numbering>

</xml_diff>